<commit_message>
Updated ggd and more
</commit_message>
<xml_diff>
--- a/GDD.docx
+++ b/GDD.docx
@@ -12,14 +12,7 @@
     </w:p>
     <w:p>
       <w:r>
-        <w:t xml:space="preserve">Nazwa </w:t>
-      </w:r>
-      <w:r>
-        <w:rPr>
-          <w:b/>
-          <w:bCs/>
-        </w:rPr>
-        <w:t>The Actor</w:t>
+        <w:t>Nazwa</w:t>
       </w:r>
     </w:p>
     <w:p>
@@ -125,16 +118,40 @@
         </w:numPr>
       </w:pPr>
       <w:r>
-        <w:t>maska ven</w:t>
-      </w:r>
-      <w:r>
-        <w:t>d</w:t>
-      </w:r>
-      <w:r>
-        <w:t>etty easter egg na wysadzenie poziomu</w:t>
+        <w:t>jak starczy czasu</w:t>
       </w:r>
     </w:p>
     <w:p>
+      <w:pPr>
+        <w:pStyle w:val="Akapitzlist"/>
+        <w:numPr>
+          <w:ilvl w:val="1"/>
+          <w:numId w:val="1"/>
+        </w:numPr>
+      </w:pPr>
+      <w:r>
+        <w:t>maska beholdera (po pokonaniu bossa, nic nie musi robic, jako trofeum tylko)</w:t>
+      </w:r>
+    </w:p>
+    <w:p>
+      <w:pPr>
+        <w:pStyle w:val="Akapitzlist"/>
+        <w:numPr>
+          <w:ilvl w:val="1"/>
+          <w:numId w:val="1"/>
+        </w:numPr>
+      </w:pPr>
+      <w:r>
+        <w:t>maska ven</w:t>
+      </w:r>
+      <w:r>
+        <w:t>d</w:t>
+      </w:r>
+      <w:r>
+        <w:t>etty easter egg na wysadzenie poziomu</w:t>
+      </w:r>
+    </w:p>
+    <w:p>
       <w:r>
         <w:t>został otwarty portal do ?????</w:t>
       </w:r>
@@ -142,7 +159,13 @@
         <w:t xml:space="preserve"> z którego wyszedł beholder</w:t>
       </w:r>
       <w:r>
-        <w:t>, szuka cie bo jesteś jedyna osoba zdolna pokonać go, reszta z twojego rodu została poswiecona żeby go przywolac. Będzie wysylac pomniejsze eldritch horrory żeby cie sprzatnac, ale masz moce których już nikt inny nie ma. Mas do dyspozycji maski i bron twojego plemienia. Co prawda została zniszczona ale jesteś w stanie ja naprawić po zebraniu wszystkich fragmentow</w:t>
+        <w:t xml:space="preserve">, szuka cie, reszta z twojego </w:t>
+      </w:r>
+      <w:r>
+        <w:t>plemienia</w:t>
+      </w:r>
+      <w:r>
+        <w:t xml:space="preserve"> została poswiecona żeby go przywolac. Będzie wysylac pomniejsze eldritch horrory żeby cie sprzatnac, ale masz moce których już nikt inny nie ma. Mas do dyspozycji maski i bron twojego plemienia. Co prawda została zniszczona ale jesteś w stanie ja naprawić po zebraniu wszystkich fragmentow</w:t>
       </w:r>
     </w:p>
     <w:sectPr>
@@ -160,7 +183,7 @@
   <w:abstractNum w:abstractNumId="0" w15:restartNumberingAfterBreak="0">
     <w:nsid w:val="6EE921FB"/>
     <w:multiLevelType w:val="hybridMultilevel"/>
-    <w:tmpl w:val="AEBE4C78"/>
+    <w:tmpl w:val="DD302066"/>
     <w:lvl w:ilvl="0" w:tplc="04150001">
       <w:start w:val="1"/>
       <w:numFmt w:val="bullet"/>
@@ -173,7 +196,7 @@
         <w:rFonts w:ascii="Symbol" w:hAnsi="Symbol" w:hint="default"/>
       </w:rPr>
     </w:lvl>
-    <w:lvl w:ilvl="1" w:tplc="04150003" w:tentative="1">
+    <w:lvl w:ilvl="1" w:tplc="04150003">
       <w:start w:val="1"/>
       <w:numFmt w:val="bullet"/>
       <w:lvlText w:val="o"/>

</xml_diff>